<commit_message>
Update manuscript, slides, README, and survey docs with this session's findings
- README.md: fix fast/full pipeline-mode documentation drift from the actual
  code (learner counts, B_area, class-weighted-learner behavior, B_boot/
  B_admin2 dead parameters) -- the docs and the pipeline's own startup log
  disagreed.
- docs/manuscript_mcn.qmd (+rendered .docx), docs/mn_prediction_slides.qmd
  (+rendered .html): update with the parsimonious-vs-complex-model LOCO
  story, area-level SAE results, and corrected benchmark numbers.
- docs/manuscript_mcn_appendix.qmd (+rendered .docx): supporting detail for
  the above.
- docs/biomarker_survey_acquisition.md, docs/micronutrient_survey_candidates.md:
  flag Tanzania 2010 and Uganda 2016 DBS-based RBP data as invalid per
  external reviewer feedback; note Rwanda RDHS annex data as validated; flag
  Uganda's 2021/22 panel survey as the correct future source.
- archive/ARCHIVE_MANIFEST.md: record the Tanzania script archival.
</commit_message>
<xml_diff>
--- a/docs/manuscript_mcn_appendix.docx
+++ b/docs/manuscript_mcn_appendix.docx
@@ -23,7 +23,7 @@
         <w:pStyle w:val="Date"/>
       </w:pPr>
       <w:r>
-        <w:t xml:space="preserve">2026-06-26</w:t>
+        <w:t xml:space="preserve">2026-08-26</w:t>
       </w:r>
     </w:p>
     <w:sdt>
@@ -152,7 +152,7 @@
         <w:pStyle w:val="FirstParagraph"/>
       </w:pPr>
       <w:r>
-        <w:t xml:space="preserve">Outcomes come from four nationally representative micronutrient or</w:t>
+        <w:t xml:space="preserve">Outcomes come from five nationally representative micronutrient or</w:t>
       </w:r>
       <w:r>
         <w:t xml:space="preserve"> </w:t>
@@ -217,9 +217,53 @@
     </w:p>
     <w:p>
       <w:pPr>
+        <w:pStyle w:val="Compact"/>
+        <w:numPr>
+          <w:ilvl w:val="0"/>
+          <w:numId w:val="1001"/>
+        </w:numPr>
+      </w:pPr>
+      <w:r>
+        <w:t xml:space="preserve">Tanzania, 2009 to 2010 (Tanzania Demographic and Health Survey, TDHS), for</w:t>
+      </w:r>
+      <w:r>
+        <w:t xml:space="preserve"> </w:t>
+      </w:r>
+      <w:r>
+        <w:t xml:space="preserve">vitamin A only.</w:t>
+      </w:r>
+    </w:p>
+    <w:p>
+      <w:pPr>
         <w:pStyle w:val="FirstParagraph"/>
       </w:pPr>
       <w:r>
+        <w:t xml:space="preserve">The first four are dedicated national micronutrient surveys; Tanzania’s</w:t>
+      </w:r>
+      <w:r>
+        <w:t xml:space="preserve"> </w:t>
+      </w:r>
+      <w:r>
+        <w:t xml:space="preserve">biomarker data instead come from the obstetric/biomarker module of an</w:t>
+      </w:r>
+      <w:r>
+        <w:t xml:space="preserve"> </w:t>
+      </w:r>
+      <w:r>
+        <w:t xml:space="preserve">ordinary DHS round, which is why it differs from the other four on several</w:t>
+      </w:r>
+      <w:r>
+        <w:t xml:space="preserve"> </w:t>
+      </w:r>
+      <w:r>
+        <w:t xml:space="preserve">dimensions noted below rather than being a straightforward fifth replicate.</w:t>
+      </w:r>
+    </w:p>
+    <w:p>
+      <w:pPr>
+        <w:pStyle w:val="BodyText"/>
+      </w:pPr>
+      <w:r>
         <w:t xml:space="preserve">Within each survey, biomarkers were extracted for women of reproductive age (15</w:t>
       </w:r>
       <w:r>
@@ -232,25 +276,49 @@
         <w:t xml:space="preserve"> </w:t>
       </w:r>
       <w:r>
-        <w:t xml:space="preserve">additionally measured adult men. Each survey is nationally representative but</w:t>
-      </w:r>
-      <w:r>
-        <w:t xml:space="preserve"> </w:t>
-      </w:r>
-      <w:r>
-        <w:t xml:space="preserve">modest in size (roughly 1,000 to 1,400 individuals per outcome), is georeferenced</w:t>
-      </w:r>
-      <w:r>
-        <w:t xml:space="preserve"> </w:t>
-      </w:r>
-      <w:r>
-        <w:t xml:space="preserve">at the survey-cluster (primary sampling unit) level, and carries survey design</w:t>
-      </w:r>
-      <w:r>
-        <w:t xml:space="preserve"> </w:t>
-      </w:r>
-      <w:r>
-        <w:t xml:space="preserve">information (sampling weights, primary sampling units, and strata).</w:t>
+        <w:t xml:space="preserve">additionally measured adult men. The four dedicated micronutrient surveys are</w:t>
+      </w:r>
+      <w:r>
+        <w:t xml:space="preserve"> </w:t>
+      </w:r>
+      <w:r>
+        <w:t xml:space="preserve">nationally representative but modest in size (roughly 1,000 to 1,400</w:t>
+      </w:r>
+      <w:r>
+        <w:t xml:space="preserve"> </w:t>
+      </w:r>
+      <w:r>
+        <w:t xml:space="preserve">individuals per outcome); Tanzania’s DHS-based vitamin-A sample is</w:t>
+      </w:r>
+      <w:r>
+        <w:t xml:space="preserve"> </w:t>
+      </w:r>
+      <w:r>
+        <w:t xml:space="preserve">substantially larger (n = 6,238 children, 9,121 women) and covers 163 admin-2</w:t>
+      </w:r>
+      <w:r>
+        <w:t xml:space="preserve"> </w:t>
+      </w:r>
+      <w:r>
+        <w:t xml:space="preserve">districts, more than the other four countries combined (206). All five are</w:t>
+      </w:r>
+      <w:r>
+        <w:t xml:space="preserve"> </w:t>
+      </w:r>
+      <w:r>
+        <w:t xml:space="preserve">georeferenced at the survey-cluster (primary sampling unit) level and carry</w:t>
+      </w:r>
+      <w:r>
+        <w:t xml:space="preserve"> </w:t>
+      </w:r>
+      <w:r>
+        <w:t xml:space="preserve">survey design information (sampling weights, primary sampling units, and</w:t>
+      </w:r>
+      <w:r>
+        <w:t xml:space="preserve"> </w:t>
+      </w:r>
+      <w:r>
+        <w:t xml:space="preserve">strata).</w:t>
       </w:r>
     </w:p>
     <w:p>
@@ -258,37 +326,61 @@
         <w:pStyle w:val="BodyText"/>
       </w:pPr>
       <w:r>
-        <w:t xml:space="preserve">Iron is measured by serum ferritin in all four countries. Vitamin A is measured</w:t>
-      </w:r>
-      <w:r>
-        <w:t xml:space="preserve"> </w:t>
-      </w:r>
-      <w:r>
-        <w:t xml:space="preserve">by retinol-binding protein (a proxy for serum retinol). Vitamin B12, folate, and</w:t>
-      </w:r>
-      <w:r>
-        <w:t xml:space="preserve"> </w:t>
-      </w:r>
-      <w:r>
-        <w:t xml:space="preserve">zinc are measured by their serum concentrations and are available in a subset of</w:t>
-      </w:r>
-      <w:r>
-        <w:t xml:space="preserve"> </w:t>
-      </w:r>
-      <w:r>
-        <w:t xml:space="preserve">countries. The cross-country comparability of these biomarkers is itself debated</w:t>
-      </w:r>
-      <w:r>
-        <w:t xml:space="preserve"> </w:t>
-      </w:r>
-      <w:r>
-        <w:t xml:space="preserve">in the nutrition field, which is one motivation for treating absolute prevalence</w:t>
-      </w:r>
-      <w:r>
-        <w:t xml:space="preserve"> </w:t>
-      </w:r>
-      <w:r>
-        <w:t xml:space="preserve">levels with caution and emphasising within-country spatial ranking.</w:t>
+        <w:t xml:space="preserve">Iron is measured by serum ferritin in the four countries where it is</w:t>
+      </w:r>
+      <w:r>
+        <w:t xml:space="preserve"> </w:t>
+      </w:r>
+      <w:r>
+        <w:t xml:space="preserve">available (all but Tanzania). Vitamin A is measured by retinol-binding</w:t>
+      </w:r>
+      <w:r>
+        <w:t xml:space="preserve"> </w:t>
+      </w:r>
+      <w:r>
+        <w:t xml:space="preserve">protein (RBP, a proxy for serum retinol) in all five countries. Vitamin B12,</w:t>
+      </w:r>
+      <w:r>
+        <w:t xml:space="preserve"> </w:t>
+      </w:r>
+      <w:r>
+        <w:t xml:space="preserve">folate, and zinc are measured by their serum concentrations and are</w:t>
+      </w:r>
+      <w:r>
+        <w:t xml:space="preserve"> </w:t>
+      </w:r>
+      <w:r>
+        <w:t xml:space="preserve">available in a subset of the four non-Tanzania countries. The cross-country</w:t>
+      </w:r>
+      <w:r>
+        <w:t xml:space="preserve"> </w:t>
+      </w:r>
+      <w:r>
+        <w:t xml:space="preserve">comparability of these biomarkers is itself debated in the nutrition field,</w:t>
+      </w:r>
+      <w:r>
+        <w:t xml:space="preserve"> </w:t>
+      </w:r>
+      <w:r>
+        <w:t xml:space="preserve">which is one motivation for treating absolute prevalence levels with caution</w:t>
+      </w:r>
+      <w:r>
+        <w:t xml:space="preserve"> </w:t>
+      </w:r>
+      <w:r>
+        <w:t xml:space="preserve">and emphasising within-country spatial ranking; Tanzania’s RBP values</w:t>
+      </w:r>
+      <w:r>
+        <w:t xml:space="preserve"> </w:t>
+      </w:r>
+      <w:r>
+        <w:t xml:space="preserve">required an additional unit correction before this comparison was even</w:t>
+      </w:r>
+      <w:r>
+        <w:t xml:space="preserve"> </w:t>
+      </w:r>
+      <w:r>
+        <w:t xml:space="preserve">possible (S4.1).</w:t>
       </w:r>
     </w:p>
     <w:bookmarkEnd w:id="20"/>
@@ -1025,7 +1117,7 @@
         <w:t xml:space="preserve"> </w:t>
       </w:r>
       <w:r>
-        <w:t xml:space="preserve">across the four DHS surveys. The</w:t>
+        <w:t xml:space="preserve">across the DHS-linked survey data for all five countries. The</w:t>
       </w:r>
       <w:r>
         <w:t xml:space="preserve"> </w:t>
@@ -1078,6 +1170,68 @@
       </w:r>
       <w:r>
         <w:t xml:space="preserve">.</w:t>
+      </w:r>
+    </w:p>
+    <w:p>
+      <w:pPr>
+        <w:pStyle w:val="BodyText"/>
+      </w:pPr>
+      <w:r>
+        <w:t xml:space="preserve">Tanzania’s Google Earth Engine extraction is markedly less complete than the</w:t>
+      </w:r>
+      <w:r>
+        <w:t xml:space="preserve"> </w:t>
+      </w:r>
+      <w:r>
+        <w:t xml:space="preserve">other four countries’: 215 columns against 539 to 559 elsewhere, spanning 8 of</w:t>
+      </w:r>
+      <w:r>
+        <w:t xml:space="preserve"> </w:t>
+      </w:r>
+      <w:r>
+        <w:t xml:space="preserve">40 predictor families and none of the 11 iSDAsoil micronutrient layers. We</w:t>
+      </w:r>
+      <w:r>
+        <w:t xml:space="preserve"> </w:t>
+      </w:r>
+      <w:r>
+        <w:t xml:space="preserve">treat this as an open data-completeness gap (</w:t>
+      </w:r>
+      <w:r>
+        <w:rPr>
+          <w:rStyle w:val="VerbatimChar"/>
+        </w:rPr>
+        <w:t xml:space="preserve">scripts/refresh_gee_coverage.R</w:t>
+      </w:r>
+      <w:r>
+        <w:t xml:space="preserve"> </w:t>
+      </w:r>
+      <w:r>
+        <w:t xml:space="preserve">regenerates every country’s extraction in one vocabulary) rather than</w:t>
+      </w:r>
+      <w:r>
+        <w:t xml:space="preserve"> </w:t>
+      </w:r>
+      <w:r>
+        <w:t xml:space="preserve">impute or backfill it, and flag it as the most likely explanation for</w:t>
+      </w:r>
+      <w:r>
+        <w:t xml:space="preserve"> </w:t>
+      </w:r>
+      <w:r>
+        <w:t xml:space="preserve">Tanzania’s comparatively weaker within-country performance and for the</w:t>
+      </w:r>
+      <w:r>
+        <w:t xml:space="preserve"> </w:t>
+      </w:r>
+      <w:r>
+        <w:t xml:space="preserve">degenerate predictions obtained when Tanzania is held out under</w:t>
+      </w:r>
+      <w:r>
+        <w:t xml:space="preserve"> </w:t>
+      </w:r>
+      <w:r>
+        <w:t xml:space="preserve">leave-one-country-out evaluation (main text Results).</w:t>
       </w:r>
     </w:p>
     <w:bookmarkEnd w:id="21"/>
@@ -1624,7 +1778,6 @@
     </w:p>
     <w:p>
       <w:pPr>
-        <w:pStyle w:val="Compact"/>
         <w:numPr>
           <w:ilvl w:val="0"/>
           <w:numId w:val="1006"/>
@@ -1641,12 +1794,485 @@
         <w:t xml:space="preserve"> </w:t>
       </w:r>
       <w:r>
-        <w:t xml:space="preserve">(women and children): retinol-binding protein below 0.70 µmol/L.</w:t>
-      </w:r>
-    </w:p>
-    <w:p>
-      <w:pPr>
-        <w:pStyle w:val="Compact"/>
+        <w:t xml:space="preserve">(women and children): retinol-binding protein below 0.70 µmol/L</w:t>
+      </w:r>
+      <w:r>
+        <w:t xml:space="preserve"> </w:t>
+      </w:r>
+      <w:r>
+        <w:t xml:space="preserve">for Gambia, Ghana, Sierra Leone and Malawi.</w:t>
+      </w:r>
+      <w:r>
+        <w:t xml:space="preserve"> </w:t>
+      </w:r>
+      <w:r>
+        <w:rPr>
+          <w:b/>
+          <w:bCs/>
+        </w:rPr>
+        <w:t xml:space="preserve">Tanzania is scored on different,</w:t>
+      </w:r>
+      <w:r>
+        <w:rPr>
+          <w:b/>
+          <w:bCs/>
+        </w:rPr>
+        <w:t xml:space="preserve"> </w:t>
+      </w:r>
+      <w:r>
+        <w:rPr>
+          <w:b/>
+          <w:bCs/>
+        </w:rPr>
+        <w:t xml:space="preserve">Tanzania-specific cut-points and is not directly comparable to this 0.70</w:t>
+      </w:r>
+      <w:r>
+        <w:rPr>
+          <w:b/>
+          <w:bCs/>
+        </w:rPr>
+        <w:t xml:space="preserve"> </w:t>
+      </w:r>
+      <w:r>
+        <w:rPr>
+          <w:b/>
+          <w:bCs/>
+        </w:rPr>
+        <w:t xml:space="preserve">threshold</w:t>
+      </w:r>
+      <w:r>
+        <w:t xml:space="preserve"> </w:t>
+      </w:r>
+      <w:r>
+        <w:t xml:space="preserve">(below).</w:t>
+      </w:r>
+    </w:p>
+    <w:p>
+      <w:pPr>
+        <w:numPr>
+          <w:ilvl w:val="0"/>
+          <w:numId w:val="1000"/>
+        </w:numPr>
+      </w:pPr>
+      <w:r>
+        <w:rPr>
+          <w:i/>
+          <w:iCs/>
+        </w:rPr>
+        <w:t xml:space="preserve">Unit conversion — confirmed.</w:t>
+      </w:r>
+      <w:r>
+        <w:t xml:space="preserve"> </w:t>
+      </w:r>
+      <w:r>
+        <w:t xml:space="preserve">Tanzania’s RBP assay reports concentration in</w:t>
+      </w:r>
+      <w:r>
+        <w:t xml:space="preserve"> </w:t>
+      </w:r>
+      <w:r>
+        <w:t xml:space="preserve">mg/L rather than µmol/L.</w:t>
+      </w:r>
+      <w:r>
+        <w:t xml:space="preserve"> </w:t>
+      </w:r>
+      <w:r>
+        <w:rPr>
+          <w:rStyle w:val="VerbatimChar"/>
+        </w:rPr>
+        <w:t xml:space="preserve">TZ61BIOMARKER.DOC</w:t>
+      </w:r>
+      <w:r>
+        <w:t xml:space="preserve"> </w:t>
+      </w:r>
+      <w:r>
+        <w:t xml:space="preserve">itself states the opposite (that</w:t>
+      </w:r>
+      <w:r>
+        <w:t xml:space="preserve"> </w:t>
+      </w:r>
+      <w:r>
+        <w:t xml:space="preserve">the field is already in µmol/L), but that label cannot be correct: the raw</w:t>
+      </w:r>
+      <w:r>
+        <w:t xml:space="preserve"> </w:t>
+      </w:r>
+      <w:r>
+        <w:t xml:space="preserve">values (median ≈ 26–27) are roughly 15–20× too large to be a physiologically</w:t>
+      </w:r>
+      <w:r>
+        <w:t xml:space="preserve"> </w:t>
+      </w:r>
+      <w:r>
+        <w:t xml:space="preserve">plausible µmol/L serum RBP concentration (normal range ≈ 1–3 µmol/L; the same</w:t>
+      </w:r>
+      <w:r>
+        <w:t xml:space="preserve"> </w:t>
+      </w:r>
+      <w:r>
+        <w:t xml:space="preserve">values divided by the RBP4 molar mass, ≈ 21.2 kDa, land at a median of 1.04</w:t>
+      </w:r>
+      <w:r>
+        <w:t xml:space="preserve"> </w:t>
+      </w:r>
+      <w:r>
+        <w:t xml:space="preserve">µmol/L in children and 1.40 µmol/L in women, which is in range). We take the</w:t>
+      </w:r>
+      <w:r>
+        <w:t xml:space="preserve"> </w:t>
+      </w:r>
+      <w:r>
+        <w:rPr>
+          <w:rStyle w:val="VerbatimChar"/>
+        </w:rPr>
+        <w:t xml:space="preserve">.DOC</w:t>
+      </w:r>
+      <w:r>
+        <w:t xml:space="preserve">’s unit label to be a copy-paste error in a boilerplate template shared</w:t>
+      </w:r>
+      <w:r>
+        <w:t xml:space="preserve"> </w:t>
+      </w:r>
+      <w:r>
+        <w:t xml:space="preserve">across DHS survey rounds, and treat the field as mg/L. Independent</w:t>
+      </w:r>
+      <w:r>
+        <w:t xml:space="preserve"> </w:t>
+      </w:r>
+      <w:r>
+        <w:t xml:space="preserve">confirmation: the DHS Program’s own published report for this survey,</w:t>
+      </w:r>
+      <w:r>
+        <w:t xml:space="preserve"> </w:t>
+      </w:r>
+      <w:r>
+        <w:rPr>
+          <w:i/>
+          <w:iCs/>
+        </w:rPr>
+        <w:t xml:space="preserve">DHS</w:t>
+      </w:r>
+      <w:r>
+        <w:rPr>
+          <w:i/>
+          <w:iCs/>
+        </w:rPr>
+        <w:t xml:space="preserve"> </w:t>
+      </w:r>
+      <w:r>
+        <w:rPr>
+          <w:i/>
+          <w:iCs/>
+        </w:rPr>
+        <w:t xml:space="preserve">Further Analysis Report NUT5,</w:t>
+      </w:r>
+      <w:r>
+        <w:rPr>
+          <w:i/>
+          <w:iCs/>
+        </w:rPr>
+        <w:t xml:space="preserve"> </w:t>
+      </w:r>
+      <w:r>
+        <w:rPr>
+          <w:i/>
+          <w:iCs/>
+        </w:rPr>
+        <w:t xml:space="preserve">“Micronutrients: Results of the 2010 Tanzania</w:t>
+      </w:r>
+      <w:r>
+        <w:rPr>
+          <w:i/>
+          <w:iCs/>
+        </w:rPr>
+        <w:t xml:space="preserve"> </w:t>
+      </w:r>
+      <w:r>
+        <w:rPr>
+          <w:i/>
+          <w:iCs/>
+        </w:rPr>
+        <w:t xml:space="preserve">Demographic and Health Survey”</w:t>
+      </w:r>
+      <w:r>
+        <w:t xml:space="preserve"> </w:t>
+      </w:r>
+      <w:r>
+        <w:t xml:space="preserve">(dhsprogram.com/pubs/pdf/NUT5/NUT5.pdf, not</w:t>
+      </w:r>
+      <w:r>
+        <w:t xml:space="preserve"> </w:t>
+      </w:r>
+      <w:r>
+        <w:t xml:space="preserve">separately catalogued in</w:t>
+      </w:r>
+      <w:r>
+        <w:t xml:space="preserve"> </w:t>
+      </w:r>
+      <w:r>
+        <w:rPr>
+          <w:rStyle w:val="VerbatimChar"/>
+        </w:rPr>
+        <w:t xml:space="preserve">references.bib</w:t>
+      </w:r>
+      <w:r>
+        <w:t xml:space="preserve">), gives Tanzania-specific RBP</w:t>
+      </w:r>
+      <w:r>
+        <w:t xml:space="preserve"> </w:t>
+      </w:r>
+      <w:r>
+        <w:t xml:space="preserve">cut-points of</w:t>
+      </w:r>
+      <w:r>
+        <w:t xml:space="preserve"> </w:t>
+      </w:r>
+      <w:r>
+        <w:rPr>
+          <w:b/>
+          <w:bCs/>
+        </w:rPr>
+        <w:t xml:space="preserve">0.825 µmol/L (children)</w:t>
+      </w:r>
+      <w:r>
+        <w:t xml:space="preserve"> </w:t>
+      </w:r>
+      <w:r>
+        <w:t xml:space="preserve">and</w:t>
+      </w:r>
+      <w:r>
+        <w:t xml:space="preserve"> </w:t>
+      </w:r>
+      <w:r>
+        <w:rPr>
+          <w:b/>
+          <w:bCs/>
+        </w:rPr>
+        <w:t xml:space="preserve">1.24 µmol/L (women)</w:t>
+      </w:r>
+      <w:r>
+        <w:t xml:space="preserve"> </w:t>
+      </w:r>
+      <w:r>
+        <w:t xml:space="preserve">rather</w:t>
+      </w:r>
+      <w:r>
+        <w:t xml:space="preserve"> </w:t>
+      </w:r>
+      <w:r>
+        <w:t xml:space="preserve">than the generic 0.70 µmol/L WHO retinol cut-point. Scoring our</w:t>
+      </w:r>
+      <w:r>
+        <w:t xml:space="preserve"> </w:t>
+      </w:r>
+      <w:r>
+        <w:t xml:space="preserve">molar-mass-converted values against</w:t>
+      </w:r>
+      <w:r>
+        <w:t xml:space="preserve"> </w:t>
+      </w:r>
+      <w:r>
+        <w:rPr>
+          <w:i/>
+          <w:iCs/>
+        </w:rPr>
+        <w:t xml:space="preserve">those</w:t>
+      </w:r>
+      <w:r>
+        <w:t xml:space="preserve"> </w:t>
+      </w:r>
+      <w:r>
+        <w:t xml:space="preserve">cut-points reproduces the</w:t>
+      </w:r>
+      <w:r>
+        <w:t xml:space="preserve"> </w:t>
+      </w:r>
+      <w:r>
+        <w:t xml:space="preserve">published national prevalence almost exactly — 31.4% vs. a published 33% in</w:t>
+      </w:r>
+      <w:r>
+        <w:t xml:space="preserve"> </w:t>
+      </w:r>
+      <w:r>
+        <w:t xml:space="preserve">children, 35.3% vs. a published ~37% in women — which is strong independent</w:t>
+      </w:r>
+      <w:r>
+        <w:t xml:space="preserve"> </w:t>
+      </w:r>
+      <w:r>
+        <w:t xml:space="preserve">evidence that the 21.2 kDa conversion is correct.</w:t>
+      </w:r>
+    </w:p>
+    <w:p>
+      <w:pPr>
+        <w:numPr>
+          <w:ilvl w:val="0"/>
+          <w:numId w:val="1000"/>
+        </w:numPr>
+      </w:pPr>
+      <w:r>
+        <w:rPr>
+          <w:i/>
+          <w:iCs/>
+        </w:rPr>
+        <w:t xml:space="preserve">Deficiency threshold — an open problem, not yet fixed.</w:t>
+      </w:r>
+      <w:r>
+        <w:t xml:space="preserve"> </w:t>
+      </w:r>
+      <w:r>
+        <w:t xml:space="preserve">The pipeline</w:t>
+      </w:r>
+      <w:r>
+        <w:t xml:space="preserve"> </w:t>
+      </w:r>
+      <w:r>
+        <w:t xml:space="preserve">currently applies the same 0.70 µmol/L cut-point used for the other four</w:t>
+      </w:r>
+      <w:r>
+        <w:t xml:space="preserve"> </w:t>
+      </w:r>
+      <w:r>
+        <w:t xml:space="preserve">countries to Tanzania as well, rather than Tanzania’s own validated 0.825 /</w:t>
+      </w:r>
+      <w:r>
+        <w:t xml:space="preserve"> </w:t>
+      </w:r>
+      <w:r>
+        <w:t xml:space="preserve">1.24 µmol/L cut-points. Because Tanzania’s RBP values sit well above 0.70 on</w:t>
+      </w:r>
+      <w:r>
+        <w:t xml:space="preserve"> </w:t>
+      </w:r>
+      <w:r>
+        <w:t xml:space="preserve">average, this understates its deficiency prevalence substantially: 22.6%</w:t>
+      </w:r>
+      <w:r>
+        <w:t xml:space="preserve"> </w:t>
+      </w:r>
+      <w:r>
+        <w:t xml:space="preserve">instead of the ~31–33% obtained (and separately published) at the correct</w:t>
+      </w:r>
+      <w:r>
+        <w:t xml:space="preserve"> </w:t>
+      </w:r>
+      <w:r>
+        <w:t xml:space="preserve">child cut-point, and, far more severely for women, 6.8–7.2% instead of</w:t>
+      </w:r>
+      <w:r>
+        <w:t xml:space="preserve"> </w:t>
+      </w:r>
+      <w:r>
+        <w:t xml:space="preserve">~35–37% at the correct women’s cut-point — a roughly five-fold undercount.</w:t>
+      </w:r>
+      <w:r>
+        <w:t xml:space="preserve"> </w:t>
+      </w:r>
+      <w:r>
+        <w:t xml:space="preserve">Every Tanzania-outcome result in this manuscript (within-country CV,</w:t>
+      </w:r>
+      <w:r>
+        <w:t xml:space="preserve"> </w:t>
+      </w:r>
+      <w:r>
+        <w:t xml:space="preserve">national estimates, LOCO transport) is computed against this understated</w:t>
+      </w:r>
+      <w:r>
+        <w:t xml:space="preserve"> </w:t>
+      </w:r>
+      <w:r>
+        <w:t xml:space="preserve">target and should be treated as provisional; we did not re-run the pipeline</w:t>
+      </w:r>
+      <w:r>
+        <w:t xml:space="preserve"> </w:t>
+      </w:r>
+      <w:r>
+        <w:t xml:space="preserve">with the corrected threshold before this submission. This is a materially</w:t>
+      </w:r>
+      <w:r>
+        <w:t xml:space="preserve"> </w:t>
+      </w:r>
+      <w:r>
+        <w:t xml:space="preserve">larger and more consequential issue than the unit-conversion question that</w:t>
+      </w:r>
+      <w:r>
+        <w:t xml:space="preserve"> </w:t>
+      </w:r>
+      <w:r>
+        <w:t xml:space="preserve">prompted this check, and it plausibly explains much of the catastrophic</w:t>
+      </w:r>
+      <w:r>
+        <w:t xml:space="preserve"> </w:t>
+      </w:r>
+      <w:r>
+        <w:t xml:space="preserve">national-level bias (77–92 pp) observed when Tanzania is held out under</w:t>
+      </w:r>
+      <w:r>
+        <w:t xml:space="preserve"> </w:t>
+      </w:r>
+      <w:r>
+        <w:t xml:space="preserve">leave-one-country-out evaluation (main text Results): a model transported</w:t>
+      </w:r>
+      <w:r>
+        <w:t xml:space="preserve"> </w:t>
+      </w:r>
+      <w:r>
+        <w:t xml:space="preserve">from the other four countries is being scored against a Tanzania</w:t>
+      </w:r>
+      <w:r>
+        <w:t xml:space="preserve"> </w:t>
+      </w:r>
+      <w:r>
+        <w:t xml:space="preserve">“truth”</w:t>
+      </w:r>
+      <w:r>
+        <w:t xml:space="preserve"> </w:t>
+      </w:r>
+      <w:r>
+        <w:t xml:space="preserve">that</w:t>
+      </w:r>
+      <w:r>
+        <w:t xml:space="preserve"> </w:t>
+      </w:r>
+      <w:r>
+        <w:t xml:space="preserve">is itself several-fold too low for women. Fixing this requires</w:t>
+      </w:r>
+      <w:r>
+        <w:t xml:space="preserve"> </w:t>
+      </w:r>
+      <w:r>
+        <w:t xml:space="preserve">country-specific thresholds in</w:t>
+      </w:r>
+      <w:r>
+        <w:t xml:space="preserve"> </w:t>
+      </w:r>
+      <w:r>
+        <w:rPr>
+          <w:rStyle w:val="VerbatimChar"/>
+        </w:rPr>
+        <w:t xml:space="preserve">src/Tanzania/1_GW_Tanzania_data_clean.R</w:t>
+      </w:r>
+      <w:r>
+        <w:t xml:space="preserve"> </w:t>
+      </w:r>
+      <w:r>
+        <w:t xml:space="preserve">followed by a full pipeline rebuild, which we flag as the single highest-</w:t>
+      </w:r>
+      <w:r>
+        <w:t xml:space="preserve"> </w:t>
+      </w:r>
+      <w:r>
+        <w:t xml:space="preserve">priority correction before Tanzania’s numbers are used for any purpose</w:t>
+      </w:r>
+      <w:r>
+        <w:t xml:space="preserve"> </w:t>
+      </w:r>
+      <w:r>
+        <w:t xml:space="preserve">beyond the present exploratory inclusion.</w:t>
+      </w:r>
+    </w:p>
+    <w:p>
+      <w:pPr>
         <w:numPr>
           <w:ilvl w:val="0"/>
           <w:numId w:val="1006"/>
@@ -1692,7 +2318,6 @@
     </w:p>
     <w:p>
       <w:pPr>
-        <w:pStyle w:val="Compact"/>
         <w:numPr>
           <w:ilvl w:val="0"/>
           <w:numId w:val="1006"/>
@@ -1726,7 +2351,6 @@
     </w:p>
     <w:p>
       <w:pPr>
-        <w:pStyle w:val="Compact"/>
         <w:numPr>
           <w:ilvl w:val="0"/>
           <w:numId w:val="1006"/>
@@ -1748,7 +2372,6 @@
     </w:p>
     <w:p>
       <w:pPr>
-        <w:pStyle w:val="Compact"/>
         <w:numPr>
           <w:ilvl w:val="0"/>
           <w:numId w:val="1006"/>
@@ -1977,9 +2600,9 @@
               <w:tblLook w:firstRow="1" w:lastRow="0" w:firstColumn="0" w:lastColumn="0" w:noHBand="0" w:noVBand="0" w:val="0020"/>
             </w:tblPr>
             <w:tblGrid>
-              <w:gridCol w:w="2657"/>
-              <w:gridCol w:w="2248"/>
-              <w:gridCol w:w="3014"/>
+              <w:gridCol w:w="1830"/>
+              <w:gridCol w:w="1548"/>
+              <w:gridCol w:w="4540"/>
             </w:tblGrid>
             <w:tr>
               <w:trPr>
@@ -2061,7 +2684,7 @@
                     <w:jc w:val="center"/>
                   </w:pPr>
                   <w:r>
-                    <w:t xml:space="preserve">mlr3superlearner (6 learners), survey-weighted aggregation</w:t>
+                    <w:t xml:space="preserve">mlr3superlearner (5 learners fast mode / 12 full mode, + class-weighted variants for rare outcomes), survey-weighted aggregation</w:t>
                   </w:r>
                 </w:p>
               </w:tc>
@@ -2661,55 +3284,267 @@
         <w:pStyle w:val="FirstParagraph"/>
       </w:pPr>
       <w:r>
-        <w:t xml:space="preserve">The individual-level SuperLearner combines six base learners: a mean (intercept)</w:t>
-      </w:r>
-      <w:r>
-        <w:t xml:space="preserve"> </w:t>
-      </w:r>
-      <w:r>
-        <w:t xml:space="preserve">learner, penalised generalised linear models (lasso, ridge, and elastic-net via</w:t>
-      </w:r>
-      <w:r>
-        <w:t xml:space="preserve"> </w:t>
-      </w:r>
-      <w:r>
-        <w:t xml:space="preserve">glmnet), a ranger random forest, gradient-boosted trees (XGBoost, depth 4,</w:t>
-      </w:r>
-      <w:r>
-        <w:t xml:space="preserve"> </w:t>
-      </w:r>
-      <w:r>
-        <w:t xml:space="preserve">learning rate 0.05, subsample 0.8), and dropout BART. For binary outcomes with</w:t>
-      </w:r>
-      <w:r>
-        <w:t xml:space="preserve"> </w:t>
-      </w:r>
-      <w:r>
-        <w:t xml:space="preserve">prevalence below 15%, class-weighted XGBoost and ranger learners are added to</w:t>
-      </w:r>
-      <w:r>
-        <w:t xml:space="preserve"> </w:t>
-      </w:r>
-      <w:r>
-        <w:t xml:space="preserve">counter class imbalance. Cross-validation folds are formed at the survey-cluster</w:t>
-      </w:r>
-      <w:r>
-        <w:t xml:space="preserve"> </w:t>
-      </w:r>
-      <w:r>
-        <w:t xml:space="preserve">(primary sampling unit) level so that individuals in the same cluster are never</w:t>
-      </w:r>
-      <w:r>
-        <w:t xml:space="preserve"> </w:t>
-      </w:r>
-      <w:r>
-        <w:t xml:space="preserve">split across folds. To produce an admin-2 map, person-level predictions are</w:t>
-      </w:r>
-      <w:r>
-        <w:t xml:space="preserve"> </w:t>
-      </w:r>
-      <w:r>
-        <w:t xml:space="preserve">averaged within each district using survey weights.</w:t>
+        <w:t xml:space="preserve">The individual-level SuperLearner is run in one of two modes with a shared</w:t>
+      </w:r>
+      <w:r>
+        <w:t xml:space="preserve"> </w:t>
+      </w:r>
+      <w:r>
+        <w:t xml:space="preserve">implementation (</w:t>
+      </w:r>
+      <w:r>
+        <w:rPr>
+          <w:rStyle w:val="VerbatimChar"/>
+        </w:rPr>
+        <w:t xml:space="preserve">R/sensitivity/mlr3_fitting.R</w:t>
+      </w:r>
+      <w:r>
+        <w:t xml:space="preserve">), so the learner count is</w:t>
+      </w:r>
+      <w:r>
+        <w:t xml:space="preserve"> </w:t>
+      </w:r>
+      <w:r>
+        <w:t xml:space="preserve">derived from the library specification at fit time rather than hard-coded.</w:t>
+      </w:r>
+      <w:r>
+        <w:t xml:space="preserve"> </w:t>
+      </w:r>
+      <w:r>
+        <w:rPr>
+          <w:b/>
+          <w:bCs/>
+        </w:rPr>
+        <w:t xml:space="preserve">Fast mode</w:t>
+      </w:r>
+      <w:r>
+        <w:t xml:space="preserve"> </w:t>
+      </w:r>
+      <w:r>
+        <w:t xml:space="preserve">(beta-testing / iteration) uses 5 base learners: a mean</w:t>
+      </w:r>
+      <w:r>
+        <w:t xml:space="preserve"> </w:t>
+      </w:r>
+      <w:r>
+        <w:t xml:space="preserve">(intercept) learner, penalised lasso and elastic-net (glmnet), a ranger</w:t>
+      </w:r>
+      <w:r>
+        <w:t xml:space="preserve"> </w:t>
+      </w:r>
+      <w:r>
+        <w:t xml:space="preserve">random forest, and gradient-boosted trees (XGBoost).</w:t>
+      </w:r>
+      <w:r>
+        <w:t xml:space="preserve"> </w:t>
+      </w:r>
+      <w:r>
+        <w:rPr>
+          <w:b/>
+          <w:bCs/>
+        </w:rPr>
+        <w:t xml:space="preserve">Full mode</w:t>
+      </w:r>
+      <w:r>
+        <w:t xml:space="preserve"> </w:t>
+      </w:r>
+      <w:r>
+        <w:t xml:space="preserve">(publication analysis) uses 12: the fast-mode set plus a ridge penalty</w:t>
+      </w:r>
+      <w:r>
+        <w:t xml:space="preserve"> </w:t>
+      </w:r>
+      <w:r>
+        <w:t xml:space="preserve">(glmnet, alpha = 0), two additional ranger configurations (</w:t>
+      </w:r>
+      <w:r>
+        <w:rPr>
+          <w:rStyle w:val="VerbatimChar"/>
+        </w:rPr>
+        <w:t xml:space="preserve">ranger_low_mtry</w:t>
+      </w:r>
+      <w:r>
+        <w:t xml:space="preserve">,</w:t>
+      </w:r>
+      <w:r>
+        <w:t xml:space="preserve"> </w:t>
+      </w:r>
+      <w:r>
+        <w:rPr>
+          <w:rStyle w:val="VerbatimChar"/>
+        </w:rPr>
+        <w:t xml:space="preserve">ranger_deep</w:t>
+      </w:r>
+      <w:r>
+        <w:t xml:space="preserve">, num.trees = 1000), a deeper XGBoost (</w:t>
+      </w:r>
+      <w:r>
+        <w:rPr>
+          <w:rStyle w:val="VerbatimChar"/>
+        </w:rPr>
+        <w:t xml:space="preserve">xgb_deep</w:t>
+      </w:r>
+      <w:r>
+        <w:t xml:space="preserve">), and three</w:t>
+      </w:r>
+      <w:r>
+        <w:t xml:space="preserve"> </w:t>
+      </w:r>
+      <w:r>
+        <w:t xml:space="preserve">Bayesian Additive Regression Trees (BART) learners at increasing tree counts</w:t>
+      </w:r>
+      <w:r>
+        <w:t xml:space="preserve"> </w:t>
+      </w:r>
+      <w:r>
+        <w:t xml:space="preserve">(50, 100, and 200 trees) — BART is the learner that holds up on the rarest</w:t>
+      </w:r>
+      <w:r>
+        <w:t xml:space="preserve"> </w:t>
+      </w:r>
+      <w:r>
+        <w:t xml:space="preserve">outcomes (women’s vitamin A and B12, at 1 to 3% prevalence), where the other</w:t>
+      </w:r>
+      <w:r>
+        <w:t xml:space="preserve"> </w:t>
+      </w:r>
+      <w:r>
+        <w:t xml:space="preserve">learners collapse toward the mean. A Gaussian process (</w:t>
+      </w:r>
+      <w:r>
+        <w:rPr>
+          <w:rStyle w:val="VerbatimChar"/>
+        </w:rPr>
+        <w:t xml:space="preserve">kernlab::gausspr</w:t>
+      </w:r>
+      <w:r>
+        <w:t xml:space="preserve">)</w:t>
+      </w:r>
+      <w:r>
+        <w:t xml:space="preserve"> </w:t>
+      </w:r>
+      <w:r>
+        <w:t xml:space="preserve">was evaluated as a 13th full-mode learner but is not included in either</w:t>
+      </w:r>
+      <w:r>
+        <w:t xml:space="preserve"> </w:t>
+      </w:r>
+      <w:r>
+        <w:t xml:space="preserve">mode as of the 2026-08 rebuild: a controlled sensitivity check refitting</w:t>
+      </w:r>
+      <w:r>
+        <w:t xml:space="preserve"> </w:t>
+      </w:r>
+      <w:r>
+        <w:t xml:space="preserve">Ghana child iron with and without it in the candidate library found it</w:t>
+      </w:r>
+      <w:r>
+        <w:t xml:space="preserve"> </w:t>
+      </w:r>
+      <w:r>
+        <w:t xml:space="preserve">received effectively zero ensemble weight (identical binary AUC to 16</w:t>
+      </w:r>
+      <w:r>
+        <w:t xml:space="preserve"> </w:t>
+      </w:r>
+      <w:r>
+        <w:t xml:space="preserve">decimal places) while being</w:t>
+      </w:r>
+      <w:r>
+        <w:t xml:space="preserve"> </w:t>
+      </w:r>
+      <m:oMath>
+        <m:r>
+          <m:t>O</m:t>
+        </m:r>
+        <m:d>
+          <m:dPr>
+            <m:begChr m:val="("/>
+            <m:endChr m:val=")"/>
+            <m:sepChr m:val=""/>
+            <m:grow/>
+          </m:dPr>
+          <m:e>
+            <m:sSup>
+              <m:e>
+                <m:r>
+                  <m:t>n</m:t>
+                </m:r>
+              </m:e>
+              <m:sup>
+                <m:r>
+                  <m:t>3</m:t>
+                </m:r>
+              </m:sup>
+            </m:sSup>
+          </m:e>
+        </m:d>
+      </m:oMath>
+      <w:r>
+        <w:t xml:space="preserve"> </w:t>
+      </w:r>
+      <w:r>
+        <w:t xml:space="preserve">in rows — costly enough that it made</w:t>
+      </w:r>
+      <w:r>
+        <w:t xml:space="preserve"> </w:t>
+      </w:r>
+      <w:r>
+        <w:t xml:space="preserve">the largest pooled LOCO fits (10,011 and 13,107 rows) impractical to</w:t>
+      </w:r>
+      <w:r>
+        <w:t xml:space="preserve"> </w:t>
+      </w:r>
+      <w:r>
+        <w:t xml:space="preserve">complete (main text Results). For binary outcomes with prevalence below</w:t>
+      </w:r>
+      <w:r>
+        <w:t xml:space="preserve"> </w:t>
+      </w:r>
+      <w:r>
+        <w:t xml:space="preserve">15%, a class-weighted XGBoost and a class-weighted ranger are appended to</w:t>
+      </w:r>
+      <w:r>
+        <w:t xml:space="preserve"> </w:t>
+      </w:r>
+      <w:r>
+        <w:t xml:space="preserve">the candidate library at fit time in both modes, so a rare outcome carries</w:t>
+      </w:r>
+      <w:r>
+        <w:t xml:space="preserve"> </w:t>
+      </w:r>
+      <w:r>
+        <w:t xml:space="preserve">7 learners in fast mode and 15 in full mode; this augmentation is a property</w:t>
+      </w:r>
+      <w:r>
+        <w:t xml:space="preserve"> </w:t>
+      </w:r>
+      <w:r>
+        <w:t xml:space="preserve">of the outcome’s prevalence, not of the mode setting. Cross-validation folds</w:t>
+      </w:r>
+      <w:r>
+        <w:t xml:space="preserve"> </w:t>
+      </w:r>
+      <w:r>
+        <w:t xml:space="preserve">are formed at the survey-cluster (primary sampling unit) level so that</w:t>
+      </w:r>
+      <w:r>
+        <w:t xml:space="preserve"> </w:t>
+      </w:r>
+      <w:r>
+        <w:t xml:space="preserve">individuals in the same cluster are never split across folds. To produce an</w:t>
+      </w:r>
+      <w:r>
+        <w:t xml:space="preserve"> </w:t>
+      </w:r>
+      <w:r>
+        <w:t xml:space="preserve">admin-2 map, person-level predictions are averaged within each district</w:t>
+      </w:r>
+      <w:r>
+        <w:t xml:space="preserve"> </w:t>
+      </w:r>
+      <w:r>
+        <w:t xml:space="preserve">using survey weights.</w:t>
       </w:r>
     </w:p>
     <w:bookmarkEnd w:id="33"/>
@@ -2757,7 +3592,7 @@
         <w:t xml:space="preserve"> </w:t>
       </w:r>
       <w:r>
-        <w:t xml:space="preserve">effective sample size for this fit is the number of polygons (14 to 87 per</w:t>
+        <w:t xml:space="preserve">effective sample size for this fit is the number of polygons (14 to 163 per</w:t>
       </w:r>
       <w:r>
         <w:t xml:space="preserve"> </w:t>
@@ -2769,7 +3604,58 @@
         <w:t xml:space="preserve"> </w:t>
       </w:r>
       <w:r>
-        <w:t xml:space="preserve">text.</w:t>
+        <w:t xml:space="preserve">text. Two uninformed baselines — a national-mean null and a covariate-free</w:t>
+      </w:r>
+      <w:r>
+        <w:t xml:space="preserve"> </w:t>
+      </w:r>
+      <w:r>
+        <w:t xml:space="preserve">spatial-only smoother on admin-2 centroid coordinates — were added to this</w:t>
+      </w:r>
+      <w:r>
+        <w:t xml:space="preserve"> </w:t>
+      </w:r>
+      <w:r>
+        <w:t xml:space="preserve">comparison in the 2026-08 methods review (S8) so that</w:t>
+      </w:r>
+      <w:r>
+        <w:t xml:space="preserve"> </w:t>
+      </w:r>
+      <w:r>
+        <w:t xml:space="preserve">“better than the</w:t>
+      </w:r>
+      <w:r>
+        <w:t xml:space="preserve"> </w:t>
+      </w:r>
+      <w:r>
+        <w:t xml:space="preserve">alternatives”</w:t>
+      </w:r>
+      <w:r>
+        <w:t xml:space="preserve"> </w:t>
+      </w:r>
+      <w:r>
+        <w:t xml:space="preserve">could be distinguished from</w:t>
+      </w:r>
+      <w:r>
+        <w:t xml:space="preserve"> </w:t>
+      </w:r>
+      <w:r>
+        <w:t xml:space="preserve">“better than doing nothing”</w:t>
+      </w:r>
+      <w:r>
+        <w:t xml:space="preserve">; neither</w:t>
+      </w:r>
+      <w:r>
+        <w:t xml:space="preserve"> </w:t>
+      </w:r>
+      <w:r>
+        <w:t xml:space="preserve">area-level SuperLearner loss variant clears the national-mean null on median</w:t>
+      </w:r>
+      <w:r>
+        <w:t xml:space="preserve"> </w:t>
+      </w:r>
+      <w:r>
+        <w:t xml:space="preserve">MAE (main text Results).</w:t>
       </w:r>
     </w:p>
     <w:bookmarkEnd w:id="34"/>
@@ -3530,13 +4416,31 @@
         <w:t xml:space="preserve"> </w:t>
       </w:r>
       <w:r>
-        <w:t xml:space="preserve">assessed by leave-one-country-out holdout: the model is trained on three</w:t>
-      </w:r>
-      <w:r>
-        <w:t xml:space="preserve"> </w:t>
-      </w:r>
-      <w:r>
-        <w:t xml:space="preserve">countries’ districts and evaluated on the fourth, which contributed no data.</w:t>
+        <w:t xml:space="preserve">assessed by leave-one-country-out holdout: the model is trained on the</w:t>
+      </w:r>
+      <w:r>
+        <w:t xml:space="preserve"> </w:t>
+      </w:r>
+      <w:r>
+        <w:t xml:space="preserve">countries with data for that outcome minus the one held out (three of the</w:t>
+      </w:r>
+      <w:r>
+        <w:t xml:space="preserve"> </w:t>
+      </w:r>
+      <w:r>
+        <w:t xml:space="preserve">four countries, for outcomes measured in four countries; four of the five,</w:t>
+      </w:r>
+      <w:r>
+        <w:t xml:space="preserve"> </w:t>
+      </w:r>
+      <w:r>
+        <w:t xml:space="preserve">for the vitamin-A outcomes now measured in five) and evaluated on the</w:t>
+      </w:r>
+      <w:r>
+        <w:t xml:space="preserve"> </w:t>
+      </w:r>
+      <w:r>
+        <w:t xml:space="preserve">held-out country, which contributed no data.</w:t>
       </w:r>
     </w:p>
     <w:p>
@@ -3911,6 +4815,396 @@
         <w:t xml:space="preserve">best-transporting outcome, under both within-country and transport evaluation.</w:t>
       </w:r>
     </w:p>
+    <w:p>
+      <w:pPr>
+        <w:pStyle w:val="Compact"/>
+        <w:numPr>
+          <w:ilvl w:val="0"/>
+          <w:numId w:val="1008"/>
+        </w:numPr>
+      </w:pPr>
+      <w:r>
+        <w:rPr>
+          <w:b/>
+          <w:bCs/>
+        </w:rPr>
+        <w:t xml:space="preserve">Reliability ceiling and uninformed baselines (2026-08 methods review).</w:t>
+      </w:r>
+      <w:r>
+        <w:t xml:space="preserve"> </w:t>
+      </w:r>
+      <w:r>
+        <w:t xml:space="preserve">Because a median admin-2 district contributes only 6 to 36 biomarker</w:t>
+      </w:r>
+      <w:r>
+        <w:t xml:space="preserve"> </w:t>
+      </w:r>
+      <w:r>
+        <w:t xml:space="preserve">measurements, a design-based sampling-noise decomposition was used to</w:t>
+      </w:r>
+      <w:r>
+        <w:t xml:space="preserve"> </w:t>
+      </w:r>
+      <w:r>
+        <w:t xml:space="preserve">estimate, per country-outcome cell, the maximum Pearson r any model could</w:t>
+      </w:r>
+      <w:r>
+        <w:t xml:space="preserve"> </w:t>
+      </w:r>
+      <w:r>
+        <w:t xml:space="preserve">achieve (</w:t>
+      </w:r>
+      <m:oMath>
+        <m:sSub>
+          <m:e>
+            <m:r>
+              <m:t>r</m:t>
+            </m:r>
+          </m:e>
+          <m:sub>
+            <m:r>
+              <m:rPr>
+                <m:sty m:val="p"/>
+              </m:rPr>
+              <m:t>max</m:t>
+            </m:r>
+          </m:sub>
+        </m:sSub>
+        <m:r>
+          <m:rPr>
+            <m:sty m:val="p"/>
+          </m:rPr>
+          <m:t>=</m:t>
+        </m:r>
+        <m:rad>
+          <m:radPr>
+            <m:degHide m:val="on"/>
+          </m:radPr>
+          <m:deg/>
+          <m:e>
+            <m:r>
+              <m:t>1</m:t>
+            </m:r>
+            <m:r>
+              <m:rPr>
+                <m:sty m:val="p"/>
+              </m:rPr>
+              <m:t>−</m:t>
+            </m:r>
+            <m:r>
+              <m:t>E</m:t>
+            </m:r>
+            <m:d>
+              <m:dPr>
+                <m:begChr m:val="["/>
+                <m:endChr m:val="]"/>
+                <m:sepChr m:val=""/>
+                <m:grow/>
+              </m:dPr>
+              <m:e>
+                <m:sSub>
+                  <m:e>
+                    <m:r>
+                      <m:t>V</m:t>
+                    </m:r>
+                  </m:e>
+                  <m:sub>
+                    <m:r>
+                      <m:rPr>
+                        <m:nor/>
+                        <m:sty m:val="p"/>
+                      </m:rPr>
+                      <m:t>sampling</m:t>
+                    </m:r>
+                  </m:sub>
+                </m:sSub>
+              </m:e>
+            </m:d>
+            <m:r>
+              <m:rPr>
+                <m:sty m:val="p"/>
+              </m:rPr>
+              <m:t>/</m:t>
+            </m:r>
+            <m:r>
+              <m:rPr>
+                <m:sty m:val="p"/>
+              </m:rPr>
+              <m:t>V</m:t>
+            </m:r>
+            <m:r>
+              <m:rPr>
+                <m:sty m:val="p"/>
+              </m:rPr>
+              <m:t>a</m:t>
+            </m:r>
+            <m:r>
+              <m:rPr>
+                <m:sty m:val="p"/>
+              </m:rPr>
+              <m:t>r</m:t>
+            </m:r>
+            <m:d>
+              <m:dPr>
+                <m:begChr m:val="("/>
+                <m:endChr m:val=")"/>
+                <m:sepChr m:val=""/>
+                <m:grow/>
+              </m:dPr>
+              <m:e>
+                <m:sSub>
+                  <m:e>
+                    <m:r>
+                      <m:t>p</m:t>
+                    </m:r>
+                  </m:e>
+                  <m:sub>
+                    <m:r>
+                      <m:rPr>
+                        <m:nor/>
+                        <m:sty m:val="p"/>
+                      </m:rPr>
+                      <m:t>obs</m:t>
+                    </m:r>
+                  </m:sub>
+                </m:sSub>
+              </m:e>
+            </m:d>
+          </m:e>
+        </m:rad>
+      </m:oMath>
+      <w:r>
+        <w:t xml:space="preserve">);</w:t>
+      </w:r>
+      <w:r>
+        <w:t xml:space="preserve"> </w:t>
+      </w:r>
+      <w:r>
+        <w:t xml:space="preserve">a national-mean null and a covariate-free spatial-only smoother were added</w:t>
+      </w:r>
+      <w:r>
+        <w:t xml:space="preserve"> </w:t>
+      </w:r>
+      <w:r>
+        <w:t xml:space="preserve">to the area-level comparison as the uninformed floor. This is reported as a</w:t>
+      </w:r>
+      <w:r>
+        <w:t xml:space="preserve"> </w:t>
+      </w:r>
+      <w:r>
+        <w:t xml:space="preserve">primary result in the main text, not a sensitivity check, because it</w:t>
+      </w:r>
+      <w:r>
+        <w:t xml:space="preserve"> </w:t>
+      </w:r>
+      <w:r>
+        <w:t xml:space="preserve">materially changes which approach is judged the strongest.</w:t>
+      </w:r>
+    </w:p>
+    <w:p>
+      <w:pPr>
+        <w:pStyle w:val="Compact"/>
+        <w:numPr>
+          <w:ilvl w:val="0"/>
+          <w:numId w:val="1008"/>
+        </w:numPr>
+      </w:pPr>
+      <w:r>
+        <w:rPr>
+          <w:b/>
+          <w:bCs/>
+        </w:rPr>
+        <w:t xml:space="preserve">Gaussian-process learner necessity.</w:t>
+      </w:r>
+      <w:r>
+        <w:t xml:space="preserve"> </w:t>
+      </w:r>
+      <w:r>
+        <w:t xml:space="preserve">The candidate 13th full-mode learner</w:t>
+      </w:r>
+      <w:r>
+        <w:t xml:space="preserve"> </w:t>
+      </w:r>
+      <w:r>
+        <w:t xml:space="preserve">(a Gaussian process) was refit against a held-out cell (Ghana child iron)</w:t>
+      </w:r>
+      <w:r>
+        <w:t xml:space="preserve"> </w:t>
+      </w:r>
+      <w:r>
+        <w:t xml:space="preserve">with and without it in the library; it received zero ensemble weight at</w:t>
+      </w:r>
+      <w:r>
+        <w:t xml:space="preserve"> </w:t>
+      </w:r>
+      <w:r>
+        <w:t xml:space="preserve">substantial (</w:t>
+      </w:r>
+      <m:oMath>
+        <m:r>
+          <m:t>O</m:t>
+        </m:r>
+        <m:d>
+          <m:dPr>
+            <m:begChr m:val="("/>
+            <m:endChr m:val=")"/>
+            <m:sepChr m:val=""/>
+            <m:grow/>
+          </m:dPr>
+          <m:e>
+            <m:sSup>
+              <m:e>
+                <m:r>
+                  <m:t>n</m:t>
+                </m:r>
+              </m:e>
+              <m:sup>
+                <m:r>
+                  <m:t>3</m:t>
+                </m:r>
+              </m:sup>
+            </m:sSup>
+          </m:e>
+        </m:d>
+      </m:oMath>
+      <w:r>
+        <w:t xml:space="preserve">) computational cost and was dropped from the stack.</w:t>
+      </w:r>
+    </w:p>
+    <w:p>
+      <w:pPr>
+        <w:pStyle w:val="Compact"/>
+        <w:numPr>
+          <w:ilvl w:val="0"/>
+          <w:numId w:val="1008"/>
+        </w:numPr>
+      </w:pPr>
+      <w:r>
+        <w:rPr>
+          <w:b/>
+          <w:bCs/>
+        </w:rPr>
+        <w:t xml:space="preserve">Pre-resampling variable-selection audit.</w:t>
+      </w:r>
+      <w:r>
+        <w:t xml:space="preserve"> </w:t>
+      </w:r>
+      <w:r>
+        <w:t xml:space="preserve">The area-level prevalence</w:t>
+      </w:r>
+      <w:r>
+        <w:t xml:space="preserve"> </w:t>
+      </w:r>
+      <w:r>
+        <w:t xml:space="preserve">recipe’s covariate pre-filter and its LOCO comparator ranking were</w:t>
+      </w:r>
+      <w:r>
+        <w:t xml:space="preserve"> </w:t>
+      </w:r>
+      <w:r>
+        <w:t xml:space="preserve">originally derived once on the full dataset before splitting into</w:t>
+      </w:r>
+      <w:r>
+        <w:t xml:space="preserve"> </w:t>
+      </w:r>
+      <w:r>
+        <w:t xml:space="preserve">resampling folds. Re-deriving the pre-filter honestly inside each fold, and</w:t>
+      </w:r>
+      <w:r>
+        <w:t xml:space="preserve"> </w:t>
+      </w:r>
+      <w:r>
+        <w:t xml:space="preserve">separating comparator selection from comparator evaluation, reduced the</w:t>
+      </w:r>
+      <w:r>
+        <w:t xml:space="preserve"> </w:t>
+      </w:r>
+      <w:r>
+        <w:t xml:space="preserve">recipe’s apparent Spearman gain by 0.16 (admin-2) to 0.30 (admin-1) and its</w:t>
+      </w:r>
+      <w:r>
+        <w:t xml:space="preserve"> </w:t>
+      </w:r>
+      <w:r>
+        <w:t xml:space="preserve">best LOCO comparator’s correlation from 0.305 to 0.117; the corrected,</w:t>
+      </w:r>
+      <w:r>
+        <w:t xml:space="preserve"> </w:t>
+      </w:r>
+      <w:r>
+        <w:t xml:space="preserve">audited numbers are reported as primary in the main text (S6-style</w:t>
+      </w:r>
+      <w:r>
+        <w:t xml:space="preserve"> </w:t>
+      </w:r>
+      <w:r>
+        <w:t xml:space="preserve">correction, though implemented outside the P1-P8 pipeline proper).</w:t>
+      </w:r>
+    </w:p>
+    <w:p>
+      <w:pPr>
+        <w:pStyle w:val="Compact"/>
+        <w:numPr>
+          <w:ilvl w:val="0"/>
+          <w:numId w:val="1008"/>
+        </w:numPr>
+      </w:pPr>
+      <w:r>
+        <w:rPr>
+          <w:b/>
+          <w:bCs/>
+        </w:rPr>
+        <w:t xml:space="preserve">Tanzania addition and held-out failure.</w:t>
+      </w:r>
+      <w:r>
+        <w:t xml:space="preserve"> </w:t>
+      </w:r>
+      <w:r>
+        <w:t xml:space="preserve">Adding Tanzania (vitamin A only)</w:t>
+      </w:r>
+      <w:r>
+        <w:t xml:space="preserve"> </w:t>
+      </w:r>
+      <w:r>
+        <w:t xml:space="preserve">as a fifth country expanded the LOCO panel from 16 to 18 outcome-holdout</w:t>
+      </w:r>
+      <w:r>
+        <w:t xml:space="preserve"> </w:t>
+      </w:r>
+      <w:r>
+        <w:t xml:space="preserve">combinations for the outcomes it contributes to. Holding out Tanzania</w:t>
+      </w:r>
+      <w:r>
+        <w:t xml:space="preserve"> </w:t>
+      </w:r>
+      <w:r>
+        <w:t xml:space="preserve">itself produced degenerate predictions and 77 to 92 percentage-point</w:t>
+      </w:r>
+      <w:r>
+        <w:t xml:space="preserve"> </w:t>
+      </w:r>
+      <w:r>
+        <w:t xml:space="preserve">national-level bias, an order of magnitude larger than any other cell,</w:t>
+      </w:r>
+      <w:r>
+        <w:t xml:space="preserve"> </w:t>
+      </w:r>
+      <w:r>
+        <w:t xml:space="preserve">which we attribute to Tanzania’s markedly incomplete covariate extraction</w:t>
+      </w:r>
+      <w:r>
+        <w:t xml:space="preserve"> </w:t>
+      </w:r>
+      <w:r>
+        <w:t xml:space="preserve">(S1.2) rather than to a genuine geographic discontinuity; this should be</w:t>
+      </w:r>
+      <w:r>
+        <w:t xml:space="preserve"> </w:t>
+      </w:r>
+      <w:r>
+        <w:t xml:space="preserve">re-examined once that extraction is completed.</w:t>
+      </w:r>
+    </w:p>
     <w:bookmarkEnd w:id="42"/>
     <w:bookmarkStart w:id="43" w:name="s9.-reproducibility"/>
     <w:p>
@@ -4010,7 +5304,37 @@
         <w:t xml:space="preserve">docs/data_sources_appendix.qmd</w:t>
       </w:r>
       <w:r>
-        <w:t xml:space="preserve">.</w:t>
+        <w:t xml:space="preserve">. The full 2026-08 methods-review audit that</w:t>
+      </w:r>
+      <w:r>
+        <w:t xml:space="preserve"> </w:t>
+      </w:r>
+      <w:r>
+        <w:t xml:space="preserve">produced the reliability-ceiling estimator, the uninformed baselines, and the</w:t>
+      </w:r>
+      <w:r>
+        <w:t xml:space="preserve"> </w:t>
+      </w:r>
+      <w:r>
+        <w:t xml:space="preserve">pre-resampling variable-selection correction (S8) is documented in</w:t>
+      </w:r>
+      <w:r>
+        <w:t xml:space="preserve"> </w:t>
+      </w:r>
+      <w:r>
+        <w:rPr>
+          <w:rStyle w:val="VerbatimChar"/>
+        </w:rPr>
+        <w:t xml:space="preserve">sandbox_parsimony/FINDINGS.md</w:t>
+      </w:r>
+      <w:r>
+        <w:t xml:space="preserve">, with its underlying scripts and output CSVs</w:t>
+      </w:r>
+      <w:r>
+        <w:t xml:space="preserve"> </w:t>
+      </w:r>
+      <w:r>
+        <w:t xml:space="preserve">in the same directory.</w:t>
       </w:r>
     </w:p>
     <w:bookmarkEnd w:id="43"/>

</xml_diff>